<commit_message>
Clarify Russian formulation of the theological question about church life
</commit_message>
<xml_diff>
--- a/docs/exposition/downloads/CTM_analysis_ru.docx
+++ b/docs/exposition/downloads/CTM_analysis_ru.docx
@@ -448,10 +448,7 @@
     </w:p>
     <w:p>
       <w:r>
-        <w:rPr>
-          <w:b w:val="0"/>
-        </w:rPr>
-        <w:t>Функциональный вопрос входит внутрь богословия. Он требует проследить связь между исповеданием и плодом церковной жизни. Человек может знать правильные формулы, но не уметь отличать истину от собственного страха. Может быть дисциплинированным прихожанином, но передавать духовному руководителю ответственность за всё происходящее. Может говорить об общении, но встречаться только с подтверждением собственной картины мира. Именно эти расхождения становятся предметом исследования.</w:t>
+        <w:t>Богословское рассмотрение Церкви включает вопрос о том, что церковная жизнь делает возможным для человека. Это требует проследить связь между исповеданием веры и плодами церковной жизни. Человек может знать правильные формулы, но не уметь отличать истину от собственного страха. Может быть дисциплинированным прихожанином, но передавать духовному руководителю ответственность за всё происходящее. Может говорить об общении, но встречаться только с подтверждением собственной картины мира. Именно эти расхождения становятся предметом исследования.</w:t>
       </w:r>
     </w:p>
     <w:p>

</xml_diff>